<commit_message>
Fixed with Mike's comments
</commit_message>
<xml_diff>
--- a/docs/ms_initial_submission.docx
+++ b/docs/ms_initial_submission.docx
@@ -582,7 +582,13 @@
         <w:spacing w:line="360" w:lineRule="auto"/>
       </w:pPr>
       <w:r>
-        <w:t>Here we argue that such a feat is becoming increasingly tangible and will provide powerful new ways of predicting how extreme heat shapes community dynamics. Physiological models can now be seamlessly integrated with biophysical models of heat and mass exchange to characterize temperatures experienced by organisms and simulate the effects of extreme heat events on the entire life cycle of species within ecological communities [14–18]. Physiological models that incorporate estimates of thermal sensitivity across species can capture the delicate balance between damage and repair in physiological systems [10,11,19,20], yielding predictions of the immediate and cumulative impacts of extreme heat on growth, survival and reproduction. Importantly, mechanistic physiological models provide vital rates (e.g., survival and reproduction) that can be integrated into population and community ecology models to capture how extreme heat events perturb interactions among species [21,22].</w:t>
+        <w:t xml:space="preserve">Here we argue that such a feat is becoming increasingly tangible and will provide powerful new ways of predicting how extreme heat shapes community dynamics. Physiological models can now be seamlessly integrated with biophysical models of heat and mass exchange to characterize temperatures experienced by organisms and simulate the effects of extreme heat events on the entire life cycle of species within ecological communities [14–18]. Physiological models that incorporate estimates of thermal sensitivity across species can capture the delicate balance between damage and repair in physiological systems [10,11,19,20], yielding predictions of the immediate and cumulative impacts of extreme heat on growth, survival and reproduction. Importantly, mechanistic physiological models provide </w:t>
+      </w:r>
+      <w:r>
+        <w:t xml:space="preserve">outputs at the individual level (e.g., energy and water requirements, waste production, activity constraints, vital rates) </w:t>
+      </w:r>
+      <w:r>
+        <w:t>that can be integrated into population and community ecology models to capture how extreme heat events perturb interactions among species [21,22].</w:t>
       </w:r>
     </w:p>
     <w:p>
@@ -591,7 +597,19 @@
         <w:spacing w:line="360" w:lineRule="auto"/>
       </w:pPr>
       <w:r>
-        <w:t>We bring together modelling approaches across diverse fields as a first step towards establishing a new, integrative framework for predicting how extreme heat will affect ecological communities and society. We focus on plants, insects and microbes given the strong interconnections between them, the relative ease with which they can be studied, and their significance to natural ecosystem health and agricultural productivity. Importantly, ‘extreme heat’ can take on a different meaning for these diverse organisms. For example, plants and animals have different thermal tolerances or can exploit microthermal environments in different ways to dampen the effects of extreme atmospheric heat events. Thermal tolerances also vary among life cycle stages/developmental processes of individual organisms; for example, in plants, vegetative tissues generally exhibit greater tolerance to high temperatures than pollen [23]. As such, ‘extreme’ will be relative to the biology of the organism in question. Our framework can capture these complexities and be extended to incorporate other, diverse interactions including the socioecological systems in which ecological communities and production systems are embedded.</w:t>
+        <w:t xml:space="preserve">We bring together modelling approaches across diverse fields as a first step towards establishing a new, integrative framework for predicting how extreme heat will affect ecological communities and society. We focus on plants, insects and microbes given the strong interconnections between them, the relative ease with which they can be studied, and their significance to natural ecosystem health and agricultural productivity. Importantly, ‘extreme heat’ can take on a different meaning for these diverse organisms. For example, plants and animals have different thermal tolerances or can exploit microthermal environments in different ways to </w:t>
+      </w:r>
+      <w:r>
+        <w:t>offset</w:t>
+      </w:r>
+      <w:r>
+        <w:t xml:space="preserve"> the effects of extreme atmospheric heat events. Thermal tolerances also vary among life cycle stages/developmental processes of individual organisms; for example, in plants, vegetative tissues generally exhibit greater tolerance to high temperatures than pollen [23]. As such, ‘extreme’ will be relative to the biology of the organism in question. Our </w:t>
+      </w:r>
+      <w:r>
+        <w:t xml:space="preserve">modelling </w:t>
+      </w:r>
+      <w:r>
+        <w:t>framework can capture these complexities and be extended to incorporate other, diverse interactions including the socioecological systems in which ecological communities and production systems are embedded.</w:t>
       </w:r>
     </w:p>
     <w:p>
@@ -752,7 +770,13 @@
               <w:t>A new, integrative framework for predicting the effects of extreme heat on ecological communities</w:t>
             </w:r>
             <w:r>
-              <w:t>. The modelling approach developed here integrates (1) climate/biophysical models to predict the different temperatures species experience in their respective microhabitats. (2) Temperatures experienced by organisms then provide inputs for damage-repair and vegetation growth or animal dynamic energy budget models that integrate temperature exposure with explicit physiological models that simulate development, behavior, survival and reproduction in response to temperature dynamics across life history stages. Physiological models can be built around the unique life cycles of the diverse species in communities, capturing lagged responses to extreme heat, phenological mismatches and mechanistically informed responses to extreme heat for species of the system in question. Outputs (behavior, growth rate, biomass accumulation, survival and reproduction) from physiological models of individual organisms can then be integrated into (3) population and community ecology models to predict population growth and community composition under a specific type of change (either to the environment or suite of interacting organisms). We then discuss how (4) environment-mediated feedback loops influence organism thermal exposure and sensitivity (e.g., water availability, microbiota), which can vary across different life stages and organs. The integration of existing models in this novel way will allow simulations at the organismal level to generate emergent predictions for entire communities. In turn, such simulations will allow quantitative predictions to be made on how extreme heatwaves perturb biological systems and allow for the development and implementation of strategies to enhance both biological and socioecological system resilience to extreme heat. Created with BioRender.com.</w:t>
+              <w:t xml:space="preserve">. The modelling approach developed here integrates (1) climate/biophysical models to predict the different temperatures species experience in their respective microhabitats. (2) Temperatures experienced by organisms then provide inputs for damage-repair and vegetation growth or animal dynamic energy budget models that integrate temperature exposure with explicit physiological models that simulate development, behavior, survival and reproduction in response to temperature dynamics across life history stages. Physiological models can be built around the unique life cycles of the diverse species in communities, capturing lagged responses to extreme heat, phenological mismatches and mechanistically informed responses to extreme heat for species of the system in question. Outputs (behavior, growth rate, biomass accumulation, survival and reproduction) from physiological models of individual organisms can then be integrated into (3) population and community ecology models to predict population growth and community composition under a specific type of change (either to the environment or suite of interacting organisms). We then discuss how (4) environment-mediated feedback loops influence organism thermal exposure and sensitivity (e.g., water availability, microbiota), which can vary across different life stages and organs. </w:t>
+            </w:r>
+            <w:r>
+              <w:t>This novel</w:t>
+            </w:r>
+            <w:r>
+              <w:t xml:space="preserve"> integration of existing models in this novel way will allow simulations at the organismal level to generate emergent predictions for entire communities. In turn, such simulations will allow quantitative predictions to be made on how extreme heatwaves perturb biological systems and allow for the development and implementation of strategies to enhance both biological and socioecological system resilience to extreme heat. Created with BioRender.com.</w:t>
             </w:r>
           </w:p>
         </w:tc>
@@ -885,7 +909,7 @@
         <w:spacing w:line="360" w:lineRule="auto"/>
       </w:pPr>
       <w:r>
-        <w:t xml:space="preserve">The primary role of LSMs is to better understand overall atmospheric dynamics rather than resolve the details of microclimates to which organisms are exposed. Thus, agronomists and ecologists have developed microclimate models that can provide more detailed inferences of environmental exposure. These microclimate models take the atmospheric conditions as independent forcing variables, together with detailed information on terrain (slope, aspect, hill shade), vegetation [plant-area index (PAI), stomatal behaviour, leaf reflectance] and soil properties (thermal and hydraulic properties) to predict how radiation, wind speed, air temperature, humidity, soil temperature and soil moisture vary on small scales. The available models vary in the physical processes they incorporate yet can be powerful in predicting relevant microclimates to organisms [33–39]. Our </w:t>
+        <w:t xml:space="preserve">The primary role of LSMs is to better understand overall atmospheric dynamics rather than resolve the details of microclimates to which organisms are exposed. Thus, agronomists and ecologists have developed microclimate models that can provide more detailed inferences of environmental exposure. These microclimate models take the atmospheric conditions as independent forcing variables, together with detailed information on terrain (slope, aspect, hill shade), vegetation [plant-area index (PAI), stomatal behaviour, leaf reflectance] and soil properties (thermal and hydraulic) to predict how radiation, wind speed, air temperature, humidity, soil temperature and soil moisture vary on small scales. The available models vary in the physical processes they incorporate yet can be powerful in predicting relevant microclimates to organisms [33–39]. Our </w:t>
       </w:r>
       <w:hyperlink r:id="rId6">
         <w:r>
@@ -1093,7 +1117,7 @@
         <w:t>et al.</w:t>
       </w:r>
       <w:r>
-        <w:t xml:space="preserve"> [11] also show that reproductive sensitivity can be higher than mortality, with heat injury accumulating faster to impact productivity earlier than survival. TLS theory also applies well to photosynthetic function in plants [52,53], highlighting the potential generality of the TLS framework and its capacity to explore plastic responses (e.g., acclimation and priming) of organisms. TLS models explicitly acknowledge that thermal sensitivity depends on the relative accumulation of damage to cellular and sub-cellular systems that compromise physiological function. Without periods of recovery, where damage can be repaired, organisms accumulate damage over time that reduces growth, and impacts survival and reproduction.</w:t>
+        <w:t xml:space="preserve"> [11] show that reproductive sensitivity can be higher than mortality, with heat injury accumulating faster to impact productivity earlier than survival. TLS theory also applies well to photosynthetic function in plants [52,53], highlighting the potential generality of the TLS framework and its capacity to explore plastic responses (e.g., acclimation and priming) of organisms. TLS models explicitly acknowledge that thermal sensitivity depends on the relative accumulation of damage to cellular and sub-cellular systems that compromise physiological function. Without periods of recovery, where damage can be repaired, organisms accumulate damage over time that reduces growth, and impacts survival and reproduction.</w:t>
       </w:r>
     </w:p>
     <w:p>
@@ -2298,7 +2322,19 @@
       </w:r>
       <w:r>
         <w:lastRenderedPageBreak/>
-        <w:t xml:space="preserve">throughout the life cycle [18]. DEB models can translate short-term (hourly) variation in factors such as temperature, toxins (e.g., toxicants, [65]) and resource availability (nutrients) [66,67] into long-term (days, months, years) effects on development, growth, reproduction and survival [15,18]. DEB theory, when combined with biophysical models more generally, allows the full water budget to be computed to account for heat stress impacts of a hydric nature [18]. Perhaps most importantly, DEB theory calculates the life cycle trajectory of an organism and so can account for the effects of timing of heat wave impacts relative to life stage. Applied to multi-species assemblages, DEB models can capture how different species’ life cycles are impacted by heat and interact with each other to predict how traits such as birth, age at maturity, reproductive events, energy flow and lifespan vary across species. While DEB models are parameter rich, necessary parameters have been estimated for &gt; 5000 species already (although there are taxonomic biases) [68,69]. New analytical approaches using phylogenetic imputation methods show promise for calculating energy budgets for species without data. Such methods have, for instance, already been used to predict DEB parameters for over 1.3 million animal species [see, 70]. In addition, software packages such as </w:t>
+        <w:t xml:space="preserve">throughout the life cycle [18]. DEB models can translate short-term (hourly) variation in factors such as temperature, toxins (e.g., toxicants, [65]) and resource availability (nutrients) [66,67] into long-term (days, months, years) effects on development, growth, reproduction and survival [15,18]. DEB theory, when combined with biophysical models more generally, allows the full water budget to be computed to account for heat stress impacts of a hydric nature [18]. Perhaps most importantly, DEB theory calculates the life cycle trajectory of an organism and so can account for the effects of timing of heat wave impacts relative to life stage. Applied to multi-species assemblages, DEB models can capture how different species’ life cycles are impacted by heat and interact with each other to predict how traits such as birth, age at maturity, reproductive events, energy flow and lifespan vary across species. DEB models </w:t>
+      </w:r>
+      <w:r>
+        <w:t xml:space="preserve">integrate many processes in a parameter-sparse manner, and </w:t>
+      </w:r>
+      <w:r>
+        <w:t xml:space="preserve">necessary parameters have been estimated for &gt; </w:t>
+      </w:r>
+      <w:r>
+        <w:t>6</w:t>
+      </w:r>
+      <w:r>
+        <w:t xml:space="preserve">000 species already (although there are taxonomic biases) [68,69]. New analytical approaches using phylogenetic imputation methods show promise for calculating energy budgets for species without data. Such methods have, for instance, already been used to predict DEB parameters for over 1.3 million animal species [see, 70]. In addition, software packages such as </w:t>
       </w:r>
       <w:r>
         <w:rPr>
@@ -2308,7 +2344,39 @@
         <w:t>NicheMapR</w:t>
       </w:r>
       <w:r>
-        <w:t xml:space="preserve"> [33,71] allow for simulations of life-cycles using parameters for diverse species. From these models, predictions on body mass and size, reproductive success and events, along with survival can be used to parameterize vital rates needed for population and community models, with additional options to incorporate eco-evolutionary feedbacks (see </w:t>
+        <w:t xml:space="preserve"> [33,71] allow for simulations of life-cycles using parameters for diverse species. </w:t>
+      </w:r>
+      <w:r>
+        <w:t>DEB model outputs, such as</w:t>
+      </w:r>
+      <w:r>
+        <w:t xml:space="preserve"> body mass and size, reproductive success and </w:t>
+      </w:r>
+      <w:r>
+        <w:t>timing</w:t>
+      </w:r>
+      <w:r>
+        <w:t xml:space="preserve">, </w:t>
+      </w:r>
+      <w:r>
+        <w:t>and</w:t>
+      </w:r>
+      <w:r>
+        <w:t xml:space="preserve"> survival</w:t>
+      </w:r>
+      <w:r>
+        <w:t>,</w:t>
+      </w:r>
+      <w:r>
+        <w:t xml:space="preserve"> can be used to parameterize vital rates needed for population and community models, with additional options to incorporate eco-evolutionary </w:t>
+      </w:r>
+      <w:proofErr w:type="gramStart"/>
+      <w:r>
+        <w:t>feedbacks</w:t>
+      </w:r>
+      <w:proofErr w:type="gramEnd"/>
+      <w:r>
+        <w:t xml:space="preserve"> (see </w:t>
       </w:r>
       <w:r>
         <w:rPr>
@@ -2327,7 +2395,7 @@
         <w:spacing w:line="360" w:lineRule="auto"/>
       </w:pPr>
       <w:r>
-        <w:t>Analogously, physiologically-based vegetation models simulate plant growth over time as a function of carbon, water and nutrient uptake and use, following mass balance principles [31]. Model drivers typically include incident radiation, humidity, rainfall, and soil properties as well as air temperature. The models capture the direct effects of temperature on key physiological processes, such as photosynthesis, respiration and phenology, as well as the indirect effects via feedbacks on the vegetation water balance and soil nutrient availability. Short-term responses to temperature are captured well in these models through representations of enzyme kinetics, but representation of longer-term responses remains challenging because plants show high flexibility in their ability to acclimate to ambient temperatures [72]. Another area under active research is capturing plant damage and death from hot-dry weather extremes. Considerable progress has been made by representing the plant hydraulic system explicitly, enabling the risk of hydraulic failure to be predicted under conditions of low rainfall and high evaporative demand [73]. Direct damage to plant tissue from extreme heat has yet to be represented in such models, but the thermal death time framework outlined above offers a promising way forwards.</w:t>
+        <w:t>Analogously, physiologically-based vegetation models simulate plant growth over time as a function of carbon, water and nutrient uptake and use, following mass balance principles [31]. Model drivers typically include incident radiation, humidity, rainfall, and soil properties as well as air temperature. The models capture the direct effects of temperature on key physiological processes, such as photosynthesis, respiration and phenology, as well as the indirect effects via feedbacks on the vegetation water balance and soil nutrient availability. Short-term responses to temperature are captured well in these models through representations of enzyme kinetics, but representation of longer-term responses remains challenging because plants show high flexibility in their ability to acclimate to ambient temperatures [72]. Another area under active research is capturing plant damage and death from hot-dry weather extremes. Considerable progress has been made by representing the plant hydraulic system explicitly, enabling the risk of hydraulic failure to be predicted under conditions of low rainfall and high evaporative demand [73]. Direct damage to plant tissue from extreme heat has yet to be represented in such models, but the thermal death time framework outlined above offers a promising way forward.</w:t>
       </w:r>
     </w:p>
     <w:p>
@@ -3201,7 +3269,48 @@
               <w:t>Figure 4- How a systems modelling approach to extreme heat can be used to inform solutions.</w:t>
             </w:r>
             <w:r>
-              <w:t xml:space="preserve"> A hypothetical example of an insect-plant interaction. (A) To counteract an extreme heat wave event, different watering scenarios to cool plants of agricultural importance during heat stress could be applied. Of critical importance is understanding how much water to apply to a system to keep plants cool while minimizing: 1) water use, given that heat waves are often associated with extreme drought conditions and 2) pest outbreaks, given watering may create more ideal conditions for pest insects. (B) We can obtain actual or predicted future climate data from weather stations or climate models for rainfall and create alternative scenarios where rainfall layers are manipulated by modifying the watering regimes during a heatwave event. We could then assess how adding 2, 5, 10, or 20 mm of water and compares to original rainfall. (C) Adding water during an extreme heat event should result in cooling effects and by using microclimate and biophysical models we can quantify how much cooling would occur by calculating leaf temperature across all scenarios. Adding 5 mm of water can result in a 3.63 Celsius decrease in leaf temperature. Adding more water does not result in significant gains in cooling. Note, in this simple example, we have assumed vegetation properties to remain constant; by linking in a crop growth model we could also estimate how the additional water would impact on plant growth and yield, enabling the trade-offs between plant shading, leaf temperatures, crop health and yield to be explored. (D) We can then use the microclimatic conditions created by the plant to better understand how these different microclimates impact grasshopper pest body temperatures using biophysical models in combination with dynamic energy budget models that simulate the entire life-cycle of the grasshopper keeping tabs on how energy and mass flow between growth (struture) and (reproduction) during adult stages. These models also include survival estimates through time (senesence) using hazards functions allowing us to estimate an intrinsic growth rate parameter (i.e., </w:t>
+              <w:t xml:space="preserve"> A hypothetical example of an insect-plant interaction. (A) To counteract an extreme heat wave event, different watering scenarios to cool plants of agricultural importance during heat stress could be applied. Of critical importance is understanding how much water to apply to a system to keep plants cool while minimizing: 1) water use, given that heat waves are often associated with extreme drought conditions and 2) pest outbreaks, given watering may create more ideal conditions for pest insects. (B) We can obtain actual or predicted future climate data from weather stations or climate models for rainfall and create alternative scenarios where rainfall layers are manipulated by modifying the watering regimes during a heatwave event. We could then assess how adding 2, 5, 10, or 20 mm </w:t>
+            </w:r>
+            <w:r>
+              <w:t>d</w:t>
+            </w:r>
+            <w:r>
+              <w:rPr>
+                <w:vertAlign w:val="superscript"/>
+              </w:rPr>
+              <w:t>-1</w:t>
+            </w:r>
+            <w:r>
+              <w:rPr>
+                <w:vertAlign w:val="superscript"/>
+              </w:rPr>
+              <w:t xml:space="preserve"> </w:t>
+            </w:r>
+            <w:r>
+              <w:t>of water and compares to original rainfall. (C) Adding water during an extreme heat event should result in cooling effects and by using microclimate and biophysical models we can quantify how much cooling would occur by calculating leaf temperature across all scenarios. Adding 5 mm of water can result in a 3.63</w:t>
+            </w:r>
+            <w:r>
+              <w:sym w:font="Symbol" w:char="F0B0"/>
+            </w:r>
+            <w:r>
+              <w:t>C</w:t>
+            </w:r>
+            <w:r>
+              <w:t xml:space="preserve"> decrease in leaf temperature. Adding more water does not result in significant gains in cooling. Note, in this simple example, we have assumed vegetation properties to remain constant; by linking in a crop growth </w:t>
+            </w:r>
+            <w:proofErr w:type="gramStart"/>
+            <w:r>
+              <w:t>model</w:t>
+            </w:r>
+            <w:proofErr w:type="gramEnd"/>
+            <w:r>
+              <w:t xml:space="preserve"> we could also estimate how the additional water would </w:t>
+            </w:r>
+            <w:r>
+              <w:t>affect</w:t>
+            </w:r>
+            <w:r>
+              <w:t xml:space="preserve"> plant growth and yield, enabling the trade-offs between plant shading, leaf temperatures, crop health and yield to be explored. (D) We can then use the microclimatic conditions created by the plant to better understand how these different microclimates impact grasshopper pest body temperatures using biophysical models in combination with dynamic energy budget models that simulate the entire life-cycle of the grasshopper keeping tabs on how energy and mass flow between growth (struture) and (reproduction) during adult stages. These models also include survival estimates through time (senesence) using hazards functions allowing us to estimate an intrinsic growth rate parameter (i.e., </w:t>
             </w:r>
             <m:oMath>
               <m:sSub>
@@ -3235,7 +3344,52 @@
             </w:r>
             <w:r>
               <w:lastRenderedPageBreak/>
-              <w:t>growth rate we can then estimate the population growth rate of grasshoppers using a simple Ricker’s population growth model applied to the different scenarios. Assuming we would add 5 mm each season during heatwave events, grasshopper populations would be suppressed over time whereas adding 2 mm results in grasshopper population growth, leading to heatwave associated outbreaks. Here, the optimal solution is thus 5 mm of water added to both 1) cool plants to protect them during a heat wave and 2) supress pest outbreaks. Created with BioRender.com.</w:t>
+              <w:t xml:space="preserve">growth rate we can then estimate the population growth rate of grasshoppers using a simple Ricker’s population growth model applied to the different scenarios. Assuming we would add 5 mm </w:t>
+            </w:r>
+            <w:r>
+              <w:t>d</w:t>
+            </w:r>
+            <w:r>
+              <w:rPr>
+                <w:vertAlign w:val="superscript"/>
+              </w:rPr>
+              <w:t>-1</w:t>
+            </w:r>
+            <w:r>
+              <w:t xml:space="preserve"> </w:t>
+            </w:r>
+            <w:r>
+              <w:t xml:space="preserve">each season during heatwave events, grasshopper populations would be suppressed over time whereas adding 2 mm </w:t>
+            </w:r>
+            <w:r>
+              <w:t>d</w:t>
+            </w:r>
+            <w:r>
+              <w:rPr>
+                <w:vertAlign w:val="superscript"/>
+              </w:rPr>
+              <w:t>-1</w:t>
+            </w:r>
+            <w:r>
+              <w:t xml:space="preserve"> </w:t>
+            </w:r>
+            <w:r>
+              <w:t xml:space="preserve">results in grasshopper population growth, leading to heatwave associated outbreaks. Here, the optimal solution is thus 5 mm </w:t>
+            </w:r>
+            <w:r>
+              <w:t>d</w:t>
+            </w:r>
+            <w:r>
+              <w:rPr>
+                <w:vertAlign w:val="superscript"/>
+              </w:rPr>
+              <w:t>-1</w:t>
+            </w:r>
+            <w:r>
+              <w:t xml:space="preserve"> </w:t>
+            </w:r>
+            <w:r>
+              <w:t>of water added to both 1) cool plants to protect them during a heat wave and 2) supress pest outbreaks. Created with BioRender.com.</w:t>
             </w:r>
           </w:p>
         </w:tc>
@@ -3294,7 +3448,10 @@
               <w:spacing w:line="360" w:lineRule="auto"/>
             </w:pPr>
             <w:r>
-              <w:t>How effective are models that use parameters of closely related species at predicting the impacts of extreme heat for species lacking data?</w:t>
+              <w:t>For data deficient species, can we use</w:t>
+            </w:r>
+            <w:r>
+              <w:t xml:space="preserve"> parameters of closely related species at predicting the impacts of extreme heat for species lacking data?</w:t>
             </w:r>
           </w:p>
           <w:p>
@@ -3435,7 +3592,13 @@
       </w:r>
       <w:r>
         <w:lastRenderedPageBreak/>
-        <w:t>physiology, ecology and evolutionary biology as well as collaboration with socio-ecologists. Nonetheless, by working collaboratively and integratively we can develop a more calculated understanding of the impacts that extreme heat will have on organisms, populations, and communities along with how to mitigate these impacts to preserve diverse systems now and into the future.</w:t>
+        <w:t xml:space="preserve">physiology, ecology and evolutionary biology as well as collaboration with socio-ecologists. Nonetheless, by working collaboratively and integratively we can develop a more </w:t>
+      </w:r>
+      <w:r>
+        <w:t xml:space="preserve">quantitative and predictive </w:t>
+      </w:r>
+      <w:r>
+        <w:t>understanding of the impacts that extreme heat will have on organisms, populations, and communities along with how to mitigate these impacts to preserve diverse systems now and into the future.</w:t>
       </w:r>
     </w:p>
     <w:p>
@@ -8576,7 +8739,6 @@
   <w:style w:type="character" w:default="1" w:styleId="DefaultParagraphFont">
     <w:name w:val="Default Paragraph Font"/>
     <w:uiPriority w:val="1"/>
-    <w:semiHidden/>
     <w:unhideWhenUsed/>
   </w:style>
   <w:style w:type="table" w:default="1" w:styleId="TableNormal">

</xml_diff>